<commit_message>
Materialien neu gebaut (D15, zweiter Teil): Akten, Papier-Bosse, Probeklausur eA, Warm-up-Karten, Präsentationen W0/W1/W3/W4, Lehrerhinweise W5 samt PDFs
Gebaut mit bauen.py und expliziter Quellliste; akten, loesungen, lehrkraft neu erzeugt (--pruefen: 0 Probleme),
PDFs unveränderter Dokumente zurückgesetzt.

Co-Authored-By: Claude Opus 5.5 <noreply@anthropic.com>
Claude-Session: https://claude.ai/code/session_01JKXVQqFeKVmyQ9jfHw4db3
</commit_message>
<xml_diff>
--- a/materialien/00_Lehrerhinweise/KR_W5_Lehrerhinweise.docx
+++ b/materialien/00_Lehrerhinweise/KR_W5_Lehrerhinweise.docx
@@ -6731,7 +6731,7 @@
           <w:color w:val="1B1B1F"/>
           <w:sz w:val="19"/>
         </w:rPr>
-        <w:t xml:space="preserve"> (in Welt 5 verwendet, Welt 6 wählt andere): nebel/nebfi 9 · anker/tor 11 · heute/morgen 22 · hafen/haffk/eis/zoo/bear 4 · post/potq 6 · ueberweisezweieuro/ueberweisetausendeuro 18 · treffenumfuenfuhr/treffenumzehnuhr 8 · sonne/geheim 0. Testfälle: „“ → 0, „a“ → 1, „Überweise 2 Euro“ → „ueberweiseeuro“ → 1 (Ziffern entfallen – Zahlen in Aufgaben immer als Wort).</w:t>
+        <w:t xml:space="preserve"> (in Welt 5 verwendet, Welt 6 wählt andere): nebel/nebfi 9 · anker/tor 11 · heute/morgen 22 (nur Folie 8) · strand/falke 21 (W5-L1-08, Korrektur D15) · hafen/haffk/eis/zoo/bear 4 · post/potq 6 · ueberweisezweieuro/ueberweisetausendeuro 18 (nur Folie 19) · sendeelfboten/sendefuenfhundertboten 10 (W5-L2-07) · liefereneunkisten/liefereneunhundertkisten 6 (W5-B-13) · treffenumfuenfuhr/treffenumzehnuhr 8 · sonne/geheim 0. Testfälle: „“ → 0, „a“ → 1, „Überweise 2 Euro“ → „ueberweiseeuro“ → 1 (Ziffern entfallen – Zahlen in Aufgaben immer als Wort).</w:t>
       </w:r>
     </w:p>
     <w:p>
@@ -10901,7 +10901,7 @@
                 <w:color w:val="1B1B1F"/>
                 <w:sz w:val="16"/>
               </w:rPr>
-              <w:t>Alice signiert „ueberweise zwei euro“ mit dem KRYPTOS-Hash. Mallory ersetzt die Nachricht durch „ueberweise tausend euro“ (KH 18) und lässt die Signatur unverändert. Bobs Prüfung ergibt [1] (gültig/ungültig). Ausgenutzt wird die fehlende [2] (Einwegeigenschaft/Kollisionsresistenz/Vertraulichkeit). Mallory benötigt Alices privaten Schlüssel: [3] (ja/nein).</w:t>
+              <w:t>Alice signiert „liefere neun kisten“ mit dem KRYPTOS-Hash. Mallory ersetzt die Nachricht durch „liefere neunhundert kisten“ (KH 6) und lässt die Signatur unverändert. Bobs Prüfung ergibt [1] (gültig/ungültig). Ausgenutzt wird die fehlende [2] (Einwegeigenschaft/Kollisionsresistenz/Vertraulichkeit). Mallory benötigt Alices privaten Schlüssel: [3] (ja/nein).</w:t>
             </w:r>
           </w:p>
         </w:tc>

</xml_diff>